<commit_message>
Docs: cost-based walkthrough completed -- reply, re-price, region rule, Block policy, floor flag, send gate, Test & Trace, line rate before tax (27 screenshots)
Co-Authored-By: Claude Fable 5.1 <noreply@anthropic.com>
</commit_message>
<xml_diff>
--- a/docs/BPMSquare_Pricing_CostBased_Walkthrough.docx
+++ b/docs/BPMSquare_Pricing_CostBased_Walkthrough.docx
@@ -37,7 +37,7 @@
         <w:spacing w:after="120"/>
       </w:pPr>
       <w:r>
-        <w:t xml:space="preserve">The cost-based pricing technique was built one step at a time (engine and data, the quote line, setup and demo) and this is the walk through it on the live demo workspace. Every screenshot below is from production after the 6 September deploy. Names and addresses shown are the demo workspace's fictional ones.</w:t>
+        <w:t xml:space="preserve">The cost-based pricing technique was built one step at a time (engine and data, the quote line, setup and demo) and this is the walk through it on the live demo workspace, end to end: from cost rates to a quote that the floor policy refuses to send. Every screenshot below is from production on 6 September. Names and addresses shown are the demo workspace's fictional ones. Four defects were found on the walk and fixed the same day; they are listed in §12.</w:t>
       </w:r>
     </w:p>
     <w:p>
@@ -538,7 +538,7 @@
                 <w:sz w:val="19"/>
                 <w:szCs w:val="19"/>
               </w:rPr>
-              <w:t xml:space="preserve">Works. SQ-2026-0002 with the three lines.</w:t>
+              <w:t xml:space="preserve">Works. SQ-2026-0002 with the three lines; after 0114 the product link and the pricing document survive the save.</w:t>
             </w:r>
           </w:p>
         </w:tc>
@@ -584,7 +584,7 @@
                 <w:sz w:val="19"/>
                 <w:szCs w:val="19"/>
               </w:rPr>
-              <w:t xml:space="preserve">BLOCKED by a database check: fixed in code, needs migration 0115 (see §8).</w:t>
+              <w:t xml:space="preserve">Works after migration 0115 (first attempt failed on a database check — fixed the same day).</w:t>
             </w:r>
           </w:p>
         </w:tc>
@@ -608,7 +608,7 @@
                 <w:sz w:val="19"/>
                 <w:szCs w:val="19"/>
               </w:rPr>
-              <w:t xml:space="preserve">Re-price line 3 from the RFQ reply, send gate on the margin floor</w:t>
+              <w:t xml:space="preserve">Re-price line 3 from the RFQ reply</w:t>
             </w:r>
           </w:p>
         </w:tc>
@@ -630,7 +630,191 @@
                 <w:sz w:val="19"/>
                 <w:szCs w:val="19"/>
               </w:rPr>
-              <w:t xml:space="preserve">Not yet exercised — depends on 0114 and 0115 being applied.</w:t>
+              <w:t xml:space="preserve">Works after a second fix: the engine dated the call by the server's UTC day, so a reply valid from today was 'not yet in force' before 05:30 IST. Now 92,500 → 143,259.38, the why trace names the source.</w:t>
+            </w:r>
+          </w:p>
+        </w:tc>
+      </w:tr>
+      <w:tr>
+        <w:tc>
+          <w:tcPr>
+            <w:tcW w:type="dxa" w:w="0"/>
+            <w:tcMar>
+              <w:top w:type="dxa" w:w="60"/>
+              <w:left w:type="dxa" w:w="100"/>
+              <w:bottom w:type="dxa" w:w="60"/>
+              <w:right w:type="dxa" w:w="100"/>
+            </w:tcMar>
+          </w:tcPr>
+          <w:p>
+            <w:r>
+              <w:rPr>
+                <w:b w:val="false"/>
+                <w:bCs w:val="false"/>
+                <w:sz w:val="19"/>
+                <w:szCs w:val="19"/>
+              </w:rPr>
+              <w:t xml:space="preserve">Margin rule for a region, floor policy Block, go live as v2</w:t>
+            </w:r>
+          </w:p>
+        </w:tc>
+        <w:tc>
+          <w:tcPr>
+            <w:tcW w:type="dxa" w:w="0"/>
+            <w:tcMar>
+              <w:top w:type="dxa" w:w="60"/>
+              <w:left w:type="dxa" w:w="100"/>
+              <w:bottom w:type="dxa" w:w="60"/>
+              <w:right w:type="dxa" w:w="100"/>
+            </w:tcMar>
+          </w:tcPr>
+          <w:p>
+            <w:r>
+              <w:rPr>
+                <w:b w:val="false"/>
+                <w:bCs w:val="false"/>
+                <w:sz w:val="19"/>
+                <w:szCs w:val="19"/>
+              </w:rPr>
+              <w:t xml:space="preserve">Works. Region Karnataka → 10% margin; Today's rates shows both rules.</w:t>
+            </w:r>
+          </w:p>
+        </w:tc>
+      </w:tr>
+      <w:tr>
+        <w:tc>
+          <w:tcPr>
+            <w:tcW w:type="dxa" w:w="0"/>
+            <w:tcMar>
+              <w:top w:type="dxa" w:w="60"/>
+              <w:left w:type="dxa" w:w="100"/>
+              <w:bottom w:type="dxa" w:w="60"/>
+              <w:right w:type="dxa" w:w="100"/>
+            </w:tcMar>
+          </w:tcPr>
+          <w:p>
+            <w:r>
+              <w:rPr>
+                <w:b w:val="false"/>
+                <w:bCs w:val="false"/>
+                <w:sz w:val="19"/>
+                <w:szCs w:val="19"/>
+              </w:rPr>
+              <w:t xml:space="preserve">Re-price under v2: floor flag on the line</w:t>
+            </w:r>
+          </w:p>
+        </w:tc>
+        <w:tc>
+          <w:tcPr>
+            <w:tcW w:type="dxa" w:w="0"/>
+            <w:tcMar>
+              <w:top w:type="dxa" w:w="60"/>
+              <w:left w:type="dxa" w:w="100"/>
+              <w:bottom w:type="dxa" w:w="60"/>
+              <w:right w:type="dxa" w:w="100"/>
+            </w:tcMar>
+          </w:tcPr>
+          <w:p>
+            <w:r>
+              <w:rPr>
+                <w:b w:val="false"/>
+                <w:bCs w:val="false"/>
+                <w:sz w:val="19"/>
+                <w:szCs w:val="19"/>
+              </w:rPr>
+              <w:t xml:space="preserve">Works. "Margin 10% is below the 15% floor — this quote can't be sent until approved" on all three lines.</w:t>
+            </w:r>
+          </w:p>
+        </w:tc>
+      </w:tr>
+      <w:tr>
+        <w:tc>
+          <w:tcPr>
+            <w:tcW w:type="dxa" w:w="0"/>
+            <w:tcMar>
+              <w:top w:type="dxa" w:w="60"/>
+              <w:left w:type="dxa" w:w="100"/>
+              <w:bottom w:type="dxa" w:w="60"/>
+              <w:right w:type="dxa" w:w="100"/>
+            </w:tcMar>
+          </w:tcPr>
+          <w:p>
+            <w:r>
+              <w:rPr>
+                <w:b w:val="false"/>
+                <w:bCs w:val="false"/>
+                <w:sz w:val="19"/>
+                <w:szCs w:val="19"/>
+              </w:rPr>
+              <w:t xml:space="preserve">Detail page and the send gate</w:t>
+            </w:r>
+          </w:p>
+        </w:tc>
+        <w:tc>
+          <w:tcPr>
+            <w:tcW w:type="dxa" w:w="0"/>
+            <w:tcMar>
+              <w:top w:type="dxa" w:w="60"/>
+              <w:left w:type="dxa" w:w="100"/>
+              <w:bottom w:type="dxa" w:w="60"/>
+              <w:right w:type="dxa" w:w="100"/>
+            </w:tcMar>
+          </w:tcPr>
+          <w:p>
+            <w:r>
+              <w:rPr>
+                <w:b w:val="false"/>
+                <w:bCs w:val="false"/>
+                <w:sz w:val="19"/>
+                <w:szCs w:val="19"/>
+              </w:rPr>
+              <w:t xml:space="preserve">Works. Flags shown per line; Email to customer refuses and names each line.</w:t>
+            </w:r>
+          </w:p>
+        </w:tc>
+      </w:tr>
+      <w:tr>
+        <w:tc>
+          <w:tcPr>
+            <w:tcW w:type="dxa" w:w="0"/>
+            <w:tcMar>
+              <w:top w:type="dxa" w:w="60"/>
+              <w:left w:type="dxa" w:w="100"/>
+              <w:bottom w:type="dxa" w:w="60"/>
+              <w:right w:type="dxa" w:w="100"/>
+            </w:tcMar>
+          </w:tcPr>
+          <w:p>
+            <w:r>
+              <w:rPr>
+                <w:b w:val="false"/>
+                <w:bCs w:val="false"/>
+                <w:sz w:val="19"/>
+                <w:szCs w:val="19"/>
+              </w:rPr>
+              <w:t xml:space="preserve">Advanced → Test &amp; Trace</w:t>
+            </w:r>
+          </w:p>
+        </w:tc>
+        <w:tc>
+          <w:tcPr>
+            <w:tcW w:type="dxa" w:w="0"/>
+            <w:tcMar>
+              <w:top w:type="dxa" w:w="60"/>
+              <w:left w:type="dxa" w:w="100"/>
+              <w:bottom w:type="dxa" w:w="60"/>
+              <w:right w:type="dxa" w:w="100"/>
+            </w:tcMar>
+          </w:tcPr>
+          <w:p>
+            <w:r>
+              <w:rPr>
+                <w:b w:val="false"/>
+                <w:bCs w:val="false"/>
+                <w:sz w:val="19"/>
+                <w:szCs w:val="19"/>
+              </w:rPr>
+              <w:t xml:space="preserve">Works. Every priced document is kept with its version and pricing date, loadable and replayable.</w:t>
             </w:r>
           </w:p>
         </w:tc>
@@ -1787,7 +1971,7 @@
         <w:spacing w:after="120"/>
       </w:pPr>
       <w:r>
-        <w:t xml:space="preserve">Saving the reply failed on production with a database check constraint (below). The cause is a migration gap, not the engine: the PURCHASE cost kind was added to the engine in 0113 but the table's allowed kinds were never widened. Migration 0115 fixes it; the route now names the migration instead of the raw error.</w:t>
+        <w:t xml:space="preserve">Saving the reply first failed on production with a database check constraint (below). The cause was a migration gap, not the engine: the PURCHASE cost kind was added to the engine in 0113 but the table's allowed kinds were never widened. Migration 0115 fixed it the same day.</w:t>
       </w:r>
     </w:p>
     <w:p>
@@ -1849,7 +2033,69 @@
           <w:sz w:val="18"/>
           <w:szCs w:val="18"/>
         </w:rPr>
-        <w:t xml:space="preserve">The error as seen on 6 September, before 0115</w:t>
+        <w:t xml:space="preserve">The error as first seen, before 0115</w:t>
+      </w:r>
+    </w:p>
+    <w:p>
+      <w:pPr>
+        <w:spacing w:after="60" w:before="120"/>
+        <w:jc w:val="center"/>
+      </w:pPr>
+      <w:r>
+        <w:drawing>
+          <wp:inline distT="0" distB="0" distL="0" distR="0">
+            <wp:extent cx="5715000" cy="2209800"/>
+            <wp:effectExtent t="0" r="0" b="0" l="0"/>
+            <wp:docPr id="1" name="" descr="" title=""/>
+            <wp:cNvGraphicFramePr>
+              <a:graphicFrameLocks xmlns:a="http://schemas.openxmlformats.org/drawingml/2006/main" noChangeAspect="1"/>
+            </wp:cNvGraphicFramePr>
+            <a:graphic xmlns:a="http://schemas.openxmlformats.org/drawingml/2006/main">
+              <a:graphicData uri="http://schemas.openxmlformats.org/drawingml/2006/picture">
+                <pic:pic xmlns:pic="http://schemas.openxmlformats.org/drawingml/2006/picture">
+                  <pic:nvPicPr>
+                    <pic:cNvPr id="0" name="" descr=""/>
+                    <pic:cNvPicPr>
+                      <a:picLocks noChangeAspect="1" noChangeArrowheads="1"/>
+                    </pic:cNvPicPr>
+                  </pic:nvPicPr>
+                  <pic:blipFill>
+                    <a:blip r:embed="rId24" cstate="none"/>
+                    <a:srcRect/>
+                    <a:stretch>
+                      <a:fillRect/>
+                    </a:stretch>
+                  </pic:blipFill>
+                  <pic:spPr bwMode="auto">
+                    <a:xfrm>
+                      <a:off x="0" y="0"/>
+                      <a:ext cx="5715000" cy="2209800"/>
+                    </a:xfrm>
+                    <a:prstGeom prst="rect">
+                      <a:avLst/>
+                    </a:prstGeom>
+                  </pic:spPr>
+                </pic:pic>
+              </a:graphicData>
+            </a:graphic>
+          </wp:inline>
+        </w:drawing>
+      </w:r>
+    </w:p>
+    <w:p>
+      <w:pPr>
+        <w:spacing w:after="200"/>
+        <w:jc w:val="center"/>
+      </w:pPr>
+      <w:r>
+        <w:rPr>
+          <w:i/>
+          <w:iCs/>
+          <w:color w:val="555555"/>
+          <w:sz w:val="18"/>
+          <w:szCs w:val="18"/>
+        </w:rPr>
+        <w:t xml:space="preserve">After 0115: the reply is on file as a confirmed cost, 92,500 per unit, valid to 31 December</w:t>
       </w:r>
     </w:p>
     <w:p>
@@ -1858,7 +2104,649 @@
         <w:spacing w:after="120" w:before="320"/>
       </w:pPr>
       <w:r>
-        <w:t xml:space="preserve">8. Findings and what is left</w:t>
+        <w:t xml:space="preserve">8. Price line 3 again — the reply is used</w:t>
+      </w:r>
+    </w:p>
+    <w:p>
+      <w:pPr>
+        <w:spacing w:after="120"/>
+      </w:pPr>
+      <w:r>
+        <w:t xml:space="preserve">Back on SQ-2026-0002 → Edit, Price with engine on line 3. The ladder's first rung (ERP cost, 95 days old) is still skipped; the second rung now answers. Purchase cost 92,500 → landed 97,125 → 25% margin → 121,406.25 → tax → 143,259.38.</w:t>
+      </w:r>
+    </w:p>
+    <w:p>
+      <w:pPr>
+        <w:spacing w:after="120"/>
+      </w:pPr>
+      <w:r>
+        <w:t xml:space="preserve">This step surfaced a second defect. On the first attempt the engine still reported NEEDS RFQ and listed the reply as "valid 2026-09-06 → 2026-12-31" among the sources it had tried and rejected. The walk was running at two in the morning India time, when the server's UTC date is still the day before, and the engine dated the call by the server's day. A reply valid from today was therefore "not yet in force" until 05:30 IST. Fixed the same day: the engine and the RFQ reply now use the workspace's own calendar date (the same timezone the attendance module keeps, Asia/Kolkata by default). The Test &amp; Trace record in §11 shows the pricing date flipping from 5 to 6 September across the fix.</w:t>
+      </w:r>
+    </w:p>
+    <w:p>
+      <w:pPr>
+        <w:spacing w:after="60" w:before="120"/>
+        <w:jc w:val="center"/>
+      </w:pPr>
+      <w:r>
+        <w:drawing>
+          <wp:inline distT="0" distB="0" distL="0" distR="0">
+            <wp:extent cx="5715000" cy="2209800"/>
+            <wp:effectExtent t="0" r="0" b="0" l="0"/>
+            <wp:docPr id="1" name="" descr="" title=""/>
+            <wp:cNvGraphicFramePr>
+              <a:graphicFrameLocks xmlns:a="http://schemas.openxmlformats.org/drawingml/2006/main" noChangeAspect="1"/>
+            </wp:cNvGraphicFramePr>
+            <a:graphic xmlns:a="http://schemas.openxmlformats.org/drawingml/2006/main">
+              <a:graphicData uri="http://schemas.openxmlformats.org/drawingml/2006/picture">
+                <pic:pic xmlns:pic="http://schemas.openxmlformats.org/drawingml/2006/picture">
+                  <pic:nvPicPr>
+                    <pic:cNvPr id="0" name="" descr=""/>
+                    <pic:cNvPicPr>
+                      <a:picLocks noChangeAspect="1" noChangeArrowheads="1"/>
+                    </pic:cNvPicPr>
+                  </pic:nvPicPr>
+                  <pic:blipFill>
+                    <a:blip r:embed="rId25" cstate="none"/>
+                    <a:srcRect/>
+                    <a:stretch>
+                      <a:fillRect/>
+                    </a:stretch>
+                  </pic:blipFill>
+                  <pic:spPr bwMode="auto">
+                    <a:xfrm>
+                      <a:off x="0" y="0"/>
+                      <a:ext cx="5715000" cy="2209800"/>
+                    </a:xfrm>
+                    <a:prstGeom prst="rect">
+                      <a:avLst/>
+                    </a:prstGeom>
+                  </pic:spPr>
+                </pic:pic>
+              </a:graphicData>
+            </a:graphic>
+          </wp:inline>
+        </w:drawing>
+      </w:r>
+    </w:p>
+    <w:p>
+      <w:pPr>
+        <w:spacing w:after="200"/>
+        <w:jc w:val="center"/>
+      </w:pPr>
+      <w:r>
+        <w:rPr>
+          <w:i/>
+          <w:iCs/>
+          <w:color w:val="555555"/>
+          <w:sz w:val="18"/>
+          <w:szCs w:val="18"/>
+        </w:rPr>
+        <w:t xml:space="preserve">Line 3 priced from the supplier's reply: 143,259.38</w:t>
+      </w:r>
+    </w:p>
+    <w:p>
+      <w:pPr>
+        <w:pStyle w:val="Heading1"/>
+        <w:spacing w:after="120" w:before="320"/>
+      </w:pPr>
+      <w:r>
+        <w:t xml:space="preserve">9. Margin rule for a region, floor policy Block, go live</w:t>
+      </w:r>
+    </w:p>
+    <w:p>
+      <w:pPr>
+        <w:spacing w:after="120"/>
+      </w:pPr>
+      <w:r>
+        <w:t xml:space="preserve">To exercise the floor, Pricing setup got a second Margin rule — when Region is Karnataka, 10% instead of 25% (Demo Motor Company is in Karnataka) — and the floor policy was switched from Warn to Block. Continue to sample bill, then Go live publishes version 2; version 1 is superseded and stays replayable.</w:t>
+      </w:r>
+    </w:p>
+    <w:p>
+      <w:pPr>
+        <w:spacing w:after="60" w:before="120"/>
+        <w:jc w:val="center"/>
+      </w:pPr>
+      <w:r>
+        <w:drawing>
+          <wp:inline distT="0" distB="0" distL="0" distR="0">
+            <wp:extent cx="5715000" cy="2209800"/>
+            <wp:effectExtent t="0" r="0" b="0" l="0"/>
+            <wp:docPr id="1" name="" descr="" title=""/>
+            <wp:cNvGraphicFramePr>
+              <a:graphicFrameLocks xmlns:a="http://schemas.openxmlformats.org/drawingml/2006/main" noChangeAspect="1"/>
+            </wp:cNvGraphicFramePr>
+            <a:graphic xmlns:a="http://schemas.openxmlformats.org/drawingml/2006/main">
+              <a:graphicData uri="http://schemas.openxmlformats.org/drawingml/2006/picture">
+                <pic:pic xmlns:pic="http://schemas.openxmlformats.org/drawingml/2006/picture">
+                  <pic:nvPicPr>
+                    <pic:cNvPr id="0" name="" descr=""/>
+                    <pic:cNvPicPr>
+                      <a:picLocks noChangeAspect="1" noChangeArrowheads="1"/>
+                    </pic:cNvPicPr>
+                  </pic:nvPicPr>
+                  <pic:blipFill>
+                    <a:blip r:embed="rId26" cstate="none"/>
+                    <a:srcRect/>
+                    <a:stretch>
+                      <a:fillRect/>
+                    </a:stretch>
+                  </pic:blipFill>
+                  <pic:spPr bwMode="auto">
+                    <a:xfrm>
+                      <a:off x="0" y="0"/>
+                      <a:ext cx="5715000" cy="2209800"/>
+                    </a:xfrm>
+                    <a:prstGeom prst="rect">
+                      <a:avLst/>
+                    </a:prstGeom>
+                  </pic:spPr>
+                </pic:pic>
+              </a:graphicData>
+            </a:graphic>
+          </wp:inline>
+        </w:drawing>
+      </w:r>
+    </w:p>
+    <w:p>
+      <w:pPr>
+        <w:spacing w:after="200"/>
+        <w:jc w:val="center"/>
+      </w:pPr>
+      <w:r>
+        <w:rPr>
+          <w:i/>
+          <w:iCs/>
+          <w:color w:val="555555"/>
+          <w:sz w:val="18"/>
+          <w:szCs w:val="18"/>
+        </w:rPr>
+        <w:t xml:space="preserve">Margin: everyone else 25%, when Region is Karnataka 10%</w:t>
+      </w:r>
+    </w:p>
+    <w:p>
+      <w:pPr>
+        <w:spacing w:after="60" w:before="120"/>
+        <w:jc w:val="center"/>
+      </w:pPr>
+      <w:r>
+        <w:drawing>
+          <wp:inline distT="0" distB="0" distL="0" distR="0">
+            <wp:extent cx="5715000" cy="2209800"/>
+            <wp:effectExtent t="0" r="0" b="0" l="0"/>
+            <wp:docPr id="1" name="" descr="" title=""/>
+            <wp:cNvGraphicFramePr>
+              <a:graphicFrameLocks xmlns:a="http://schemas.openxmlformats.org/drawingml/2006/main" noChangeAspect="1"/>
+            </wp:cNvGraphicFramePr>
+            <a:graphic xmlns:a="http://schemas.openxmlformats.org/drawingml/2006/main">
+              <a:graphicData uri="http://schemas.openxmlformats.org/drawingml/2006/picture">
+                <pic:pic xmlns:pic="http://schemas.openxmlformats.org/drawingml/2006/picture">
+                  <pic:nvPicPr>
+                    <pic:cNvPr id="0" name="" descr=""/>
+                    <pic:cNvPicPr>
+                      <a:picLocks noChangeAspect="1" noChangeArrowheads="1"/>
+                    </pic:cNvPicPr>
+                  </pic:nvPicPr>
+                  <pic:blipFill>
+                    <a:blip r:embed="rId27" cstate="none"/>
+                    <a:srcRect/>
+                    <a:stretch>
+                      <a:fillRect/>
+                    </a:stretch>
+                  </pic:blipFill>
+                  <pic:spPr bwMode="auto">
+                    <a:xfrm>
+                      <a:off x="0" y="0"/>
+                      <a:ext cx="5715000" cy="2209800"/>
+                    </a:xfrm>
+                    <a:prstGeom prst="rect">
+                      <a:avLst/>
+                    </a:prstGeom>
+                  </pic:spPr>
+                </pic:pic>
+              </a:graphicData>
+            </a:graphic>
+          </wp:inline>
+        </w:drawing>
+      </w:r>
+    </w:p>
+    <w:p>
+      <w:pPr>
+        <w:spacing w:after="200"/>
+        <w:jc w:val="center"/>
+      </w:pPr>
+      <w:r>
+        <w:rPr>
+          <w:i/>
+          <w:iCs/>
+          <w:color w:val="555555"/>
+          <w:sz w:val="18"/>
+          <w:szCs w:val="18"/>
+        </w:rPr>
+        <w:t xml:space="preserve">Floor policy: block sending until it is re-priced or approved</w:t>
+      </w:r>
+    </w:p>
+    <w:p>
+      <w:pPr>
+        <w:spacing w:after="60" w:before="120"/>
+        <w:jc w:val="center"/>
+      </w:pPr>
+      <w:r>
+        <w:drawing>
+          <wp:inline distT="0" distB="0" distL="0" distR="0">
+            <wp:extent cx="5715000" cy="2209800"/>
+            <wp:effectExtent t="0" r="0" b="0" l="0"/>
+            <wp:docPr id="1" name="" descr="" title=""/>
+            <wp:cNvGraphicFramePr>
+              <a:graphicFrameLocks xmlns:a="http://schemas.openxmlformats.org/drawingml/2006/main" noChangeAspect="1"/>
+            </wp:cNvGraphicFramePr>
+            <a:graphic xmlns:a="http://schemas.openxmlformats.org/drawingml/2006/main">
+              <a:graphicData uri="http://schemas.openxmlformats.org/drawingml/2006/picture">
+                <pic:pic xmlns:pic="http://schemas.openxmlformats.org/drawingml/2006/picture">
+                  <pic:nvPicPr>
+                    <pic:cNvPr id="0" name="" descr=""/>
+                    <pic:cNvPicPr>
+                      <a:picLocks noChangeAspect="1" noChangeArrowheads="1"/>
+                    </pic:cNvPicPr>
+                  </pic:nvPicPr>
+                  <pic:blipFill>
+                    <a:blip r:embed="rId28" cstate="none"/>
+                    <a:srcRect/>
+                    <a:stretch>
+                      <a:fillRect/>
+                    </a:stretch>
+                  </pic:blipFill>
+                  <pic:spPr bwMode="auto">
+                    <a:xfrm>
+                      <a:off x="0" y="0"/>
+                      <a:ext cx="5715000" cy="2209800"/>
+                    </a:xfrm>
+                    <a:prstGeom prst="rect">
+                      <a:avLst/>
+                    </a:prstGeom>
+                  </pic:spPr>
+                </pic:pic>
+              </a:graphicData>
+            </a:graphic>
+          </wp:inline>
+        </w:drawing>
+      </w:r>
+    </w:p>
+    <w:p>
+      <w:pPr>
+        <w:spacing w:after="200"/>
+        <w:jc w:val="center"/>
+      </w:pPr>
+      <w:r>
+        <w:rPr>
+          <w:i/>
+          <w:iCs/>
+          <w:color w:val="555555"/>
+          <w:sz w:val="18"/>
+          <w:szCs w:val="18"/>
+        </w:rPr>
+        <w:t xml:space="preserve">Today's rates after going live: both margin rules in plain language</w:t>
+      </w:r>
+    </w:p>
+    <w:p>
+      <w:pPr>
+        <w:pStyle w:val="Heading1"/>
+        <w:spacing w:after="120" w:before="320"/>
+      </w:pPr>
+      <w:r>
+        <w:t xml:space="preserve">10. The floor flag and the send gate</w:t>
+      </w:r>
+    </w:p>
+    <w:p>
+      <w:pPr>
+        <w:spacing w:after="120"/>
+      </w:pPr>
+      <w:r>
+        <w:t xml:space="preserve">Price with engine on all three lines under version 2. The why trace now also says where each cost figure came from — the rate kept by hand for material, labour and salvage on line 1; the supplier RFQ reply, confirmed, on line 3 — in the same words the setup screen uses. Margin is 10% against a 15% floor, so every line carries the block flag.</w:t>
+      </w:r>
+    </w:p>
+    <w:p>
+      <w:pPr>
+        <w:spacing w:after="60" w:before="120"/>
+        <w:jc w:val="center"/>
+      </w:pPr>
+      <w:r>
+        <w:drawing>
+          <wp:inline distT="0" distB="0" distL="0" distR="0">
+            <wp:extent cx="5715000" cy="2209800"/>
+            <wp:effectExtent t="0" r="0" b="0" l="0"/>
+            <wp:docPr id="1" name="" descr="" title=""/>
+            <wp:cNvGraphicFramePr>
+              <a:graphicFrameLocks xmlns:a="http://schemas.openxmlformats.org/drawingml/2006/main" noChangeAspect="1"/>
+            </wp:cNvGraphicFramePr>
+            <a:graphic xmlns:a="http://schemas.openxmlformats.org/drawingml/2006/main">
+              <a:graphicData uri="http://schemas.openxmlformats.org/drawingml/2006/picture">
+                <pic:pic xmlns:pic="http://schemas.openxmlformats.org/drawingml/2006/picture">
+                  <pic:nvPicPr>
+                    <pic:cNvPr id="0" name="" descr=""/>
+                    <pic:cNvPicPr>
+                      <a:picLocks noChangeAspect="1" noChangeArrowheads="1"/>
+                    </pic:cNvPicPr>
+                  </pic:nvPicPr>
+                  <pic:blipFill>
+                    <a:blip r:embed="rId29" cstate="none"/>
+                    <a:srcRect/>
+                    <a:stretch>
+                      <a:fillRect/>
+                    </a:stretch>
+                  </pic:blipFill>
+                  <pic:spPr bwMode="auto">
+                    <a:xfrm>
+                      <a:off x="0" y="0"/>
+                      <a:ext cx="5715000" cy="2209800"/>
+                    </a:xfrm>
+                    <a:prstGeom prst="rect">
+                      <a:avLst/>
+                    </a:prstGeom>
+                  </pic:spPr>
+                </pic:pic>
+              </a:graphicData>
+            </a:graphic>
+          </wp:inline>
+        </w:drawing>
+      </w:r>
+    </w:p>
+    <w:p>
+      <w:pPr>
+        <w:spacing w:after="200"/>
+        <w:jc w:val="center"/>
+      </w:pPr>
+      <w:r>
+        <w:rPr>
+          <w:i/>
+          <w:iCs/>
+          <w:color w:val="555555"/>
+          <w:sz w:val="18"/>
+          <w:szCs w:val="18"/>
+        </w:rPr>
+        <w:t xml:space="preserve">Line 1 under v2: the Karnataka margin rule, the floor flag, and the cost sources in the trace</w:t>
+      </w:r>
+    </w:p>
+    <w:p>
+      <w:pPr>
+        <w:spacing w:after="60" w:before="120"/>
+        <w:jc w:val="center"/>
+      </w:pPr>
+      <w:r>
+        <w:drawing>
+          <wp:inline distT="0" distB="0" distL="0" distR="0">
+            <wp:extent cx="5715000" cy="2209800"/>
+            <wp:effectExtent t="0" r="0" b="0" l="0"/>
+            <wp:docPr id="1" name="" descr="" title=""/>
+            <wp:cNvGraphicFramePr>
+              <a:graphicFrameLocks xmlns:a="http://schemas.openxmlformats.org/drawingml/2006/main" noChangeAspect="1"/>
+            </wp:cNvGraphicFramePr>
+            <a:graphic xmlns:a="http://schemas.openxmlformats.org/drawingml/2006/main">
+              <a:graphicData uri="http://schemas.openxmlformats.org/drawingml/2006/picture">
+                <pic:pic xmlns:pic="http://schemas.openxmlformats.org/drawingml/2006/picture">
+                  <pic:nvPicPr>
+                    <pic:cNvPr id="0" name="" descr=""/>
+                    <pic:cNvPicPr>
+                      <a:picLocks noChangeAspect="1" noChangeArrowheads="1"/>
+                    </pic:cNvPicPr>
+                  </pic:nvPicPr>
+                  <pic:blipFill>
+                    <a:blip r:embed="rId30" cstate="none"/>
+                    <a:srcRect/>
+                    <a:stretch>
+                      <a:fillRect/>
+                    </a:stretch>
+                  </pic:blipFill>
+                  <pic:spPr bwMode="auto">
+                    <a:xfrm>
+                      <a:off x="0" y="0"/>
+                      <a:ext cx="5715000" cy="2209800"/>
+                    </a:xfrm>
+                    <a:prstGeom prst="rect">
+                      <a:avLst/>
+                    </a:prstGeom>
+                  </pic:spPr>
+                </pic:pic>
+              </a:graphicData>
+            </a:graphic>
+          </wp:inline>
+        </w:drawing>
+      </w:r>
+    </w:p>
+    <w:p>
+      <w:pPr>
+        <w:spacing w:after="200"/>
+        <w:jc w:val="center"/>
+      </w:pPr>
+      <w:r>
+        <w:rPr>
+          <w:i/>
+          <w:iCs/>
+          <w:color w:val="555555"/>
+          <w:sz w:val="18"/>
+          <w:szCs w:val="18"/>
+        </w:rPr>
+        <w:t xml:space="preserve">Line 3: purchase cost from the supplier RFQ reply, confirmed</w:t>
+      </w:r>
+    </w:p>
+    <w:p>
+      <w:pPr>
+        <w:spacing w:after="120"/>
+      </w:pPr>
+      <w:r>
+        <w:t xml:space="preserve">Saved, the detail page shows the flag on each line. Email to customer refuses and names every line that is below the floor; the quote waits until it is re-priced or approved (approvals are batch 3).</w:t>
+      </w:r>
+    </w:p>
+    <w:p>
+      <w:pPr>
+        <w:spacing w:after="60" w:before="120"/>
+        <w:jc w:val="center"/>
+      </w:pPr>
+      <w:r>
+        <w:drawing>
+          <wp:inline distT="0" distB="0" distL="0" distR="0">
+            <wp:extent cx="5715000" cy="2209800"/>
+            <wp:effectExtent t="0" r="0" b="0" l="0"/>
+            <wp:docPr id="1" name="" descr="" title=""/>
+            <wp:cNvGraphicFramePr>
+              <a:graphicFrameLocks xmlns:a="http://schemas.openxmlformats.org/drawingml/2006/main" noChangeAspect="1"/>
+            </wp:cNvGraphicFramePr>
+            <a:graphic xmlns:a="http://schemas.openxmlformats.org/drawingml/2006/main">
+              <a:graphicData uri="http://schemas.openxmlformats.org/drawingml/2006/picture">
+                <pic:pic xmlns:pic="http://schemas.openxmlformats.org/drawingml/2006/picture">
+                  <pic:nvPicPr>
+                    <pic:cNvPr id="0" name="" descr=""/>
+                    <pic:cNvPicPr>
+                      <a:picLocks noChangeAspect="1" noChangeArrowheads="1"/>
+                    </pic:cNvPicPr>
+                  </pic:nvPicPr>
+                  <pic:blipFill>
+                    <a:blip r:embed="rId31" cstate="none"/>
+                    <a:srcRect/>
+                    <a:stretch>
+                      <a:fillRect/>
+                    </a:stretch>
+                  </pic:blipFill>
+                  <pic:spPr bwMode="auto">
+                    <a:xfrm>
+                      <a:off x="0" y="0"/>
+                      <a:ext cx="5715000" cy="2209800"/>
+                    </a:xfrm>
+                    <a:prstGeom prst="rect">
+                      <a:avLst/>
+                    </a:prstGeom>
+                  </pic:spPr>
+                </pic:pic>
+              </a:graphicData>
+            </a:graphic>
+          </wp:inline>
+        </w:drawing>
+      </w:r>
+    </w:p>
+    <w:p>
+      <w:pPr>
+        <w:spacing w:after="200"/>
+        <w:jc w:val="center"/>
+      </w:pPr>
+      <w:r>
+        <w:rPr>
+          <w:i/>
+          <w:iCs/>
+          <w:color w:val="555555"/>
+          <w:sz w:val="18"/>
+          <w:szCs w:val="18"/>
+        </w:rPr>
+        <w:t xml:space="preserve">SQ-2026-0002 with the flags under each line</w:t>
+      </w:r>
+    </w:p>
+    <w:p>
+      <w:pPr>
+        <w:spacing w:after="60" w:before="120"/>
+        <w:jc w:val="center"/>
+      </w:pPr>
+      <w:r>
+        <w:drawing>
+          <wp:inline distT="0" distB="0" distL="0" distR="0">
+            <wp:extent cx="5715000" cy="2209800"/>
+            <wp:effectExtent t="0" r="0" b="0" l="0"/>
+            <wp:docPr id="1" name="" descr="" title=""/>
+            <wp:cNvGraphicFramePr>
+              <a:graphicFrameLocks xmlns:a="http://schemas.openxmlformats.org/drawingml/2006/main" noChangeAspect="1"/>
+            </wp:cNvGraphicFramePr>
+            <a:graphic xmlns:a="http://schemas.openxmlformats.org/drawingml/2006/main">
+              <a:graphicData uri="http://schemas.openxmlformats.org/drawingml/2006/picture">
+                <pic:pic xmlns:pic="http://schemas.openxmlformats.org/drawingml/2006/picture">
+                  <pic:nvPicPr>
+                    <pic:cNvPr id="0" name="" descr=""/>
+                    <pic:cNvPicPr>
+                      <a:picLocks noChangeAspect="1" noChangeArrowheads="1"/>
+                    </pic:cNvPicPr>
+                  </pic:nvPicPr>
+                  <pic:blipFill>
+                    <a:blip r:embed="rId32" cstate="none"/>
+                    <a:srcRect/>
+                    <a:stretch>
+                      <a:fillRect/>
+                    </a:stretch>
+                  </pic:blipFill>
+                  <pic:spPr bwMode="auto">
+                    <a:xfrm>
+                      <a:off x="0" y="0"/>
+                      <a:ext cx="5715000" cy="2209800"/>
+                    </a:xfrm>
+                    <a:prstGeom prst="rect">
+                      <a:avLst/>
+                    </a:prstGeom>
+                  </pic:spPr>
+                </pic:pic>
+              </a:graphicData>
+            </a:graphic>
+          </wp:inline>
+        </w:drawing>
+      </w:r>
+    </w:p>
+    <w:p>
+      <w:pPr>
+        <w:spacing w:after="200"/>
+        <w:jc w:val="center"/>
+      </w:pPr>
+      <w:r>
+        <w:rPr>
+          <w:i/>
+          <w:iCs/>
+          <w:color w:val="555555"/>
+          <w:sz w:val="18"/>
+          <w:szCs w:val="18"/>
+        </w:rPr>
+        <w:t xml:space="preserve">Email to customer refused: each line named with its margin and the floor</w:t>
+      </w:r>
+    </w:p>
+    <w:p>
+      <w:pPr>
+        <w:pStyle w:val="Heading1"/>
+        <w:spacing w:after="120" w:before="320"/>
+      </w:pPr>
+      <w:r>
+        <w:t xml:space="preserve">11. Advanced → Test &amp; Trace</w:t>
+      </w:r>
+    </w:p>
+    <w:p>
+      <w:pPr>
+        <w:spacing w:after="120"/>
+      </w:pPr>
+      <w:r>
+        <w:t xml:space="preserve">Every price the engine produced during the walk is kept as a document with its version, pricing date and net, and can be loaded back into the tester or replayed against any version. The pricing date column shows 5 September on the early documents and 6 September after the timezone fix.</w:t>
+      </w:r>
+    </w:p>
+    <w:p>
+      <w:pPr>
+        <w:spacing w:after="60" w:before="120"/>
+        <w:jc w:val="center"/>
+      </w:pPr>
+      <w:r>
+        <w:drawing>
+          <wp:inline distT="0" distB="0" distL="0" distR="0">
+            <wp:extent cx="5715000" cy="2209800"/>
+            <wp:effectExtent t="0" r="0" b="0" l="0"/>
+            <wp:docPr id="1" name="" descr="" title=""/>
+            <wp:cNvGraphicFramePr>
+              <a:graphicFrameLocks xmlns:a="http://schemas.openxmlformats.org/drawingml/2006/main" noChangeAspect="1"/>
+            </wp:cNvGraphicFramePr>
+            <a:graphic xmlns:a="http://schemas.openxmlformats.org/drawingml/2006/main">
+              <a:graphicData uri="http://schemas.openxmlformats.org/drawingml/2006/picture">
+                <pic:pic xmlns:pic="http://schemas.openxmlformats.org/drawingml/2006/picture">
+                  <pic:nvPicPr>
+                    <pic:cNvPr id="0" name="" descr=""/>
+                    <pic:cNvPicPr>
+                      <a:picLocks noChangeAspect="1" noChangeArrowheads="1"/>
+                    </pic:cNvPicPr>
+                  </pic:nvPicPr>
+                  <pic:blipFill>
+                    <a:blip r:embed="rId33" cstate="none"/>
+                    <a:srcRect/>
+                    <a:stretch>
+                      <a:fillRect/>
+                    </a:stretch>
+                  </pic:blipFill>
+                  <pic:spPr bwMode="auto">
+                    <a:xfrm>
+                      <a:off x="0" y="0"/>
+                      <a:ext cx="5715000" cy="2209800"/>
+                    </a:xfrm>
+                    <a:prstGeom prst="rect">
+                      <a:avLst/>
+                    </a:prstGeom>
+                  </pic:spPr>
+                </pic:pic>
+              </a:graphicData>
+            </a:graphic>
+          </wp:inline>
+        </w:drawing>
+      </w:r>
+    </w:p>
+    <w:p>
+      <w:pPr>
+        <w:spacing w:after="200"/>
+        <w:jc w:val="center"/>
+      </w:pPr>
+      <w:r>
+        <w:rPr>
+          <w:i/>
+          <w:iCs/>
+          <w:color w:val="555555"/>
+          <w:sz w:val="18"/>
+          <w:szCs w:val="18"/>
+        </w:rPr>
+        <w:t xml:space="preserve">Recent priced documents: version, pricing date, net, load and replay</w:t>
+      </w:r>
+    </w:p>
+    <w:p>
+      <w:pPr>
+        <w:pStyle w:val="Heading1"/>
+        <w:spacing w:after="120" w:before="320"/>
+      </w:pPr>
+      <w:r>
+        <w:t xml:space="preserve">12. Findings and what is left</w:t>
       </w:r>
     </w:p>
     <w:p>
@@ -1867,7 +2755,7 @@
         <w:spacing w:after="100" w:before="240"/>
       </w:pPr>
       <w:r>
-        <w:t xml:space="preserve">Fixed in code, waiting on SQL</w:t>
+        <w:t xml:space="preserve">Found on this walk and fixed the same day</w:t>
       </w:r>
     </w:p>
     <w:p>
@@ -1884,10 +2772,10 @@
           <w:b/>
           <w:bCs/>
         </w:rPr>
-        <w:t xml:space="preserve">0115 — RFQ reply cannot be recorded. </w:t>
-      </w:r>
-      <w:r>
-        <w:t xml:space="preserve">pricing_cost_inputs rejects kind PURCHASE. Run 0115 on both databases; then the reply saves as a confirmed, product-scoped cost and the next Price with engine on line 3 uses it.</w:t>
+        <w:t xml:space="preserve">0115 — RFQ reply could not be recorded. </w:t>
+      </w:r>
+      <w:r>
+        <w:t xml:space="preserve">pricing_cost_inputs rejected kind PURCHASE. Applied on both databases.</w:t>
       </w:r>
     </w:p>
     <w:p>
@@ -1907,16 +2795,7 @@
         <w:t xml:space="preserve">0114 — Standard Quote lines. </w:t>
       </w:r>
       <w:r>
-        <w:t xml:space="preserve">Adds product, pricing document and flags to standard_quote_lines and the back-reference on RFQs. Until applied, a saved Standard Quote drops the product link and the document id, so the send gate on the margin floor and the flag on the detail page cannot fire.</w:t>
-      </w:r>
-    </w:p>
-    <w:p>
-      <w:pPr>
-        <w:pStyle w:val="Heading2"/>
-        <w:spacing w:after="100" w:before="240"/>
-      </w:pPr>
-      <w:r>
-        <w:t xml:space="preserve">Decision needed</w:t>
+        <w:t xml:space="preserve">Product, pricing document and flags on standard_quote_lines and the back-reference on RFQs. Applied on both databases; the save now keeps the product and the document, so the gate and the flag work.</w:t>
       </w:r>
     </w:p>
     <w:p>
@@ -1933,19 +2812,10 @@
           <w:b/>
           <w:bCs/>
         </w:rPr>
-        <w:t xml:space="preserve">The engine's rate includes tax. </w:t>
-      </w:r>
-      <w:r>
-        <w:t xml:space="preserve">The cost-based procedure ends with TAX → FINAL and the line rate is FINAL ÷ qty (26,390.70 includes 18% tax). Both quote forms also carry their own header Tax %. If a rep sets header tax as well, tax is charged twice. Options: the line takes NET_2 (pre-tax) and the header applies tax, or the procedure's tax step is kept and the form is told to leave header tax at 0. Recommendation: line takes NET_2.</w:t>
-      </w:r>
-    </w:p>
-    <w:p>
-      <w:pPr>
-        <w:pStyle w:val="Heading2"/>
-        <w:spacing w:after="100" w:before="240"/>
-      </w:pPr>
-      <w:r>
-        <w:t xml:space="preserve">Still to walk once 0114 and 0115 are applied</w:t>
+        <w:t xml:space="preserve">The engine's "today" was the server's UTC day. </w:t>
+      </w:r>
+      <w:r>
+        <w:t xml:space="preserve">Between midnight and 05:30 IST a cost or reply dated today was not yet in force. The engine and the RFQ reply now use the workspace's calendar date (config.wfm.timezone, Asia/Kolkata by default). Explicit pricing dates passed by the API are untouched.</w:t>
       </w:r>
     </w:p>
     <w:p>
@@ -1958,7 +2828,23 @@
         <w:spacing w:after="60"/>
       </w:pPr>
       <w:r>
-        <w:t xml:space="preserve">Enter the RFQ reply, open SQ-2026-0002 → Edit, Price with engine on line 3: the why chip should show source RFQ, confirmed, dated today.</w:t>
+        <w:rPr>
+          <w:b/>
+          <w:bCs/>
+        </w:rPr>
+        <w:t xml:space="preserve">The why trace did not name the cost source. </w:t>
+      </w:r>
+      <w:r>
+        <w:t xml:space="preserve">The engine carried it; the chip did not show it. It now reads, for example, "92,500 × 1 · from supplier RFQ reply, confirmed, as of 2026-09-05".</w:t>
+      </w:r>
+    </w:p>
+    <w:p>
+      <w:pPr>
+        <w:pStyle w:val="Heading2"/>
+        <w:spacing w:after="100" w:before="240"/>
+      </w:pPr>
+      <w:r>
+        <w:t xml:space="preserve">Decided after the walk: the line rate is before tax</w:t>
       </w:r>
     </w:p>
     <w:p>
@@ -1971,7 +2857,85 @@
         <w:spacing w:after="60"/>
       </w:pPr>
       <w:r>
-        <w:t xml:space="preserve">Lower the margin below 15% on one line and save: the detail page shows the flag; with the floor policy set to Block, Email to customer refuses with the line named.</w:t>
+        <w:rPr>
+          <w:b/>
+          <w:bCs/>
+        </w:rPr>
+        <w:t xml:space="preserve">The rates in this document include tax. </w:t>
+      </w:r>
+      <w:r>
+        <w:t xml:space="preserve">During the walk the line rate was FINAL ÷ qty (26,390.70 on line 1 includes 18% tax) while both quote forms also carry a header Tax %, so tax could be charged twice. Owner decision the same day: the line takes the pre-tax figure (NET_2: 22,365 on line 1) and the header applies tax once; the engine still runs its tax step so the trace and the sample bill show the full bill, and the form fills the header tax from the engine when the rep has not set one. Built, deployed and re-checked the same day (below): the same quote re-priced lands 19,681.20 / 3,06,075 / 1,06,837.50 on the lines, the header tax fills to 18%, and the total is unchanged at 5,10,461.</w:t>
+      </w:r>
+    </w:p>
+    <w:p>
+      <w:pPr>
+        <w:spacing w:after="60" w:before="120"/>
+        <w:jc w:val="center"/>
+      </w:pPr>
+      <w:r>
+        <w:drawing>
+          <wp:inline distT="0" distB="0" distL="0" distR="0">
+            <wp:extent cx="5715000" cy="2457450"/>
+            <wp:effectExtent t="0" r="0" b="0" l="0"/>
+            <wp:docPr id="1" name="" descr="" title=""/>
+            <wp:cNvGraphicFramePr>
+              <a:graphicFrameLocks xmlns:a="http://schemas.openxmlformats.org/drawingml/2006/main" noChangeAspect="1"/>
+            </wp:cNvGraphicFramePr>
+            <a:graphic xmlns:a="http://schemas.openxmlformats.org/drawingml/2006/main">
+              <a:graphicData uri="http://schemas.openxmlformats.org/drawingml/2006/picture">
+                <pic:pic xmlns:pic="http://schemas.openxmlformats.org/drawingml/2006/picture">
+                  <pic:nvPicPr>
+                    <pic:cNvPr id="0" name="" descr=""/>
+                    <pic:cNvPicPr>
+                      <a:picLocks noChangeAspect="1" noChangeArrowheads="1"/>
+                    </pic:cNvPicPr>
+                  </pic:nvPicPr>
+                  <pic:blipFill>
+                    <a:blip r:embed="rId34" cstate="none"/>
+                    <a:srcRect/>
+                    <a:stretch>
+                      <a:fillRect/>
+                    </a:stretch>
+                  </pic:blipFill>
+                  <pic:spPr bwMode="auto">
+                    <a:xfrm>
+                      <a:off x="0" y="0"/>
+                      <a:ext cx="5715000" cy="2457450"/>
+                    </a:xfrm>
+                    <a:prstGeom prst="rect">
+                      <a:avLst/>
+                    </a:prstGeom>
+                  </pic:spPr>
+                </pic:pic>
+              </a:graphicData>
+            </a:graphic>
+          </wp:inline>
+        </w:drawing>
+      </w:r>
+    </w:p>
+    <w:p>
+      <w:pPr>
+        <w:spacing w:after="200"/>
+        <w:jc w:val="center"/>
+      </w:pPr>
+      <w:r>
+        <w:rPr>
+          <w:i/>
+          <w:iCs/>
+          <w:color w:val="555555"/>
+          <w:sz w:val="18"/>
+          <w:szCs w:val="18"/>
+        </w:rPr>
+        <w:t xml:space="preserve">After the change: line rate before tax, header tax 18%, same total</w:t>
+      </w:r>
+    </w:p>
+    <w:p>
+      <w:pPr>
+        <w:pStyle w:val="Heading2"/>
+        <w:spacing w:after="100" w:before="240"/>
+      </w:pPr>
+      <w:r>
+        <w:t xml:space="preserve">Observed, not changed</w:t>
       </w:r>
     </w:p>
     <w:p>
@@ -1984,7 +2948,20 @@
         <w:spacing w:after="60"/>
       </w:pPr>
       <w:r>
-        <w:t xml:space="preserve">Pricing → Advanced → Test &amp; Trace: the three stored pricing documents with their replay.</w:t>
+        <w:t xml:space="preserve">The RFQ reply recorded before the timezone fix carries as-of 2026-09-05 (the UTC day at the time). Harmless — it is inside every freshness limit — and replies recorded from now on carry the workspace date.</w:t>
+      </w:r>
+    </w:p>
+    <w:p>
+      <w:pPr>
+        <w:pStyle w:val="ListParagraph"/>
+        <w:numPr>
+          <w:ilvl w:val="0"/>
+          <w:numId w:val="2"/>
+        </w:numPr>
+        <w:spacing w:after="60"/>
+      </w:pPr>
+      <w:r>
+        <w:t xml:space="preserve">The Go live banner in the Pricing shell only appears after a page load that finds a draft; the wizard's own save creates the draft, so the first time a user finishes the numbers step they may need to reload to see it. Small, worth a follow-up.</w:t>
       </w:r>
     </w:p>
     <w:p>

</xml_diff>